<commit_message>
Revise Chapters 1-3 from humanised draft; repair meaning errors
Applied the humanised draft's natural phrasing where sound while
fixing its defects: three meaning inversions (host/home country,
dropped 'arrival side', coding rules 'prevent' vs maintain the
evidence-type separation), the silently deleted search-strategy
placeholder, the Asia-rating misstatement, a garbled Wan et al.
claim, APA and British English corrections, and grammar repairs.
Chapter openings rewritten from mechanical section listings to
intellectual-progression prose; Introduction opening now cited.
Full Parts A-G report in thesis/review_gates/. Compiled md/txt/docx
regenerated with the unchanged, gated Chapter 4.

Co-Authored-By: Claude Fable 5 <noreply@anthropic.com>
Claude-Session: https://claude.ai/code/session_01HJq9GBe6o3FZumGTYdfLDW
</commit_message>
<xml_diff>
--- a/thesis/COMPILED_DRAFT_CH1-4.docx
+++ b/thesis/COMPILED_DRAFT_CH1-4.docx
@@ -12,7 +12,7 @@
     </w:p>
     <w:p>
       <w:r>
-        <w:t>International manufacturing location has become one of the most actively debated questions in international business. After several decades in which firms from high-cost economies relocated production to Asian host countries, a growing number of manufacturers are now considering, announcing, or attempting the opposite movement: reshoring, understood as the return of previously offshored manufacturing activities from an Asian host country to the firm's home country. While the reasons for considering such a return have been examined extensively, considerably less is known about what happens when firms actually attempt to carry it out. This thesis addresses that question through a systematic literature review of the barriers that manufacturing firms face when implementing reshoring strategies from Asian markets. This chapter introduces the study. Section 1.1 outlines the development of offshore manufacturing in Asia, the changing risk environment, and the emergence of reshoring. Section 1.2 defines the research problem and presents the research questions. Section 1.3 states the objectives of the study.</w:t>
+        <w:t>The location of manufacturing abroad is one of the most debated issues in international business. Following several decades in which firms moved production to Asian host countries, an increasing number of manufacturers are considering, announcing, or attempting the opposite movement: reshoring, the return of previously offshored manufacturing activities from an Asian host country to the firm's home country. Macro-level evidence shows that relocation has long run in both directions, with offshoring and return movements occurring in parallel (Gao et al., 2022). The motives behind such returns have been explored in detail, but much less is known about what happens when companies actually try to make the move (Ocicka, 2016; Pedroletti &amp; Ciabuschi, 2023). This thesis addresses that question by systematically reviewing the literature on the barriers that manufacturing firms encounter when implementing reshoring strategies from Asian markets. The chapter first traces the development of offshore manufacturing in Asia and the changing conditions surrounding international production. It then identifies the implementation gap addressed by the study and formulates the research questions and objectives that guide the subsequent analysis.</w:t>
       </w:r>
     </w:p>
     <w:p>
@@ -25,17 +25,17 @@
     </w:p>
     <w:p>
       <w:r>
-        <w:t>For decades, manufacturing firms from Europe and North America transferred production activities to Asian locations in pursuit of lower factor costs, with China in particular developing into the centre of global manufacturing networks. This location pattern, however, has never been static. Macro-level analyses of global manufacturing location show that offshoring, reshoring, and re-offshoring movements have occurred in parallel rather than in sequence, with production shifting between countries and industries throughout the period following the global financial crisis (Gao et al., 2022). Within Asia itself, rising production costs in China have pushed labour-intensive manufacturers to relocate activities towards Southeast Asian countries (Yang, 2016). Such intra-Asian relocation illustrates the pressure on established manufacturing configurations, but it is important to note that it does not constitute reshoring: production that moves from China to Vietnam remains offshore from the perspective of the Western home country.</w:t>
+        <w:t>For decades, manufacturing firms from Europe and North America transferred production activities to Asian locations in pursuit of lower factor costs, with China in particular developing into the centre of global manufacturing networks. This location pattern, however, has never been static. Macro-level analyses of global manufacturing location show that offshoring, reshoring, and re-offshoring movements have occurred in parallel rather than in sequence, with production shifting between countries and industries throughout the period following the global financial crisis (Gao et al., 2022). Within Asia itself, rising production costs in China have pushed labour-intensive manufacturers to relocate activities towards Southeast Asian countries (Yang, 2016). Such intra-Asian relocation illustrates the pressure on established manufacturing configurations, but it does not constitute reshoring: production that moves from China to Vietnam remains offshore from the perspective of the Western home country.</w:t>
       </w:r>
     </w:p>
     <w:p>
       <w:r>
-        <w:t>The risk environment surrounding Asian manufacturing has also changed. Geoeconomic fragmentation and trade tensions have raised concerns about supply-chain vulnerability, although dependence on Chinese inputs has proven persistent, with value chains often rerouted through third countries rather than eliminated (McCully &amp; Simola, 2024). Part of this adjustment has taken the form of substitution within Asia, as other Asian economies absorb stages of production formerly concentrated in China (Xing et al., 2024). In Europe, the COVID-19 pandemic intensified the political and academic debate on reindustrialisation and strengthened interest in returning manufacturing capacity to home markets (Somoza Medina, 2022). These developments have moved the location question from a purely cost-driven calculation towards a broader assessment of risk, resilience, and control.</w:t>
+        <w:t>The risk environment surrounding Asian manufacturing has also changed. Geoeconomic fragmentation and trade tensions have raised concerns about supply-chain vulnerability, but reliance on Chinese inputs has remained persistent, with value chains frequently rerouted through third countries rather than eliminated (McCully &amp; Simola, 2024). Some of this adjustment has taken the form of substitution within Asia, with other Asian economies taking over stages of production that were previously concentrated in China (Xing et al., 2024). In Europe, the COVID-19 pandemic further fuelled the political and academic debate on reindustrialisation and strengthened interest in bringing manufacturing capacity back to home markets (Somoza Medina, 2022). These developments have shifted the location decision from a largely cost-based calculation towards a broader assessment of risk, resilience, and control.</w:t>
       </w:r>
     </w:p>
     <w:p>
       <w:r>
-        <w:t>Against this background, reshoring has attracted growing attention from firms, policymakers, and researchers. Policy initiatives in home countries, particularly in the United States, have actively promoted the return of manufacturing (Bolter &amp; Robey, 2020). Recent survey evidence connects reshoring decisions to Industry 4.0 adoption, pandemic experiences, and made-in effects (Stentoft et al., 2025), and firm-level research indicates that the propensity to reshore varies with home-country conditions (Wan et al., 2019). Yet a decision to reshore is not the same as a completed return of production. Implementing reshoring requires the firm to rebuild or reacquire manufacturing capacity, competences, and supplier relationships in the home country, and the literature has repeatedly noted that these implementation issues have received far less attention than the reshoring decision itself (Ocicka, 2016; Pedroletti &amp; Ciabuschi, 2023). It is precisely at this implementation stage that many of the practical difficulties of reshoring arise, which makes the barriers to implementation a relevant and timely object of study.</w:t>
+        <w:t>In this context, reshoring has become a topic of increasing interest for companies, policymakers, and academics. In home countries, particularly the United States, policy measures have actively encouraged the return of manufacturing (Bolter &amp; Robey, 2020). Recent survey evidence links reshoring decisions to Industry 4.0 adoption, pandemic experiences, and made-in effects (Stentoft et al., 2025), and firm-level research suggests that the likelihood of reshoring depends on home-country conditions (Wan et al., 2019). However, a decision to reshore does not necessarily mean that production is successfully returned. Implementation requires the firm to rebuild or reacquire manufacturing capacity, competences, and supplier relationships in the home country, and the literature has repeatedly pointed out that these implementation issues have received much less attention than the decision itself (Ocicka, 2016; Pedroletti &amp; Ciabuschi, 2023). It is precisely at this implementation stage that many of the practical difficulties of reshoring arise, which makes the barriers to implementation a relevant and timely object of study.</w:t>
       </w:r>
     </w:p>
     <w:p>
@@ -48,12 +48,12 @@
     </w:p>
     <w:p>
       <w:r>
-        <w:t>The reshoring literature has concentrated primarily on drivers, that is, on the motives that lead firms to consider relocating production back to the home country. The implementation side of reshoring — the difficulties that arise when a firm prepares, transfers, rebuilds, integrates, and stabilises production at home — is comparatively underexplored, and existing findings on such barriers remain fragmented across individual studies (Ocicka, 2016; Pedroletti &amp; Ciabuschi, 2023). Moreover, the evidence is rarely organised around the specific situation of firms returning from Asian host countries, even though Asia is the dominant offshore manufacturing location and the setting in which most reshoring projects originate. There is therefore no consolidated, firm-level account of the barriers that manufacturing firms face when they attempt to implement reshoring from Asian markets.</w:t>
+        <w:t>The reshoring literature has focused mainly on drivers, that is, the reasons why companies might want to bring production back to the home country. The implementation side of reshoring — the difficulties faced by a company when it prepares, transfers, rebuilds, integrates, and stabilises production at home — is less studied, and the available evidence on these barriers is scattered across individual studies (Ocicka, 2016; Pedroletti &amp; Ciabuschi, 2023). Furthermore, the evidence is rarely structured around the specific situation of firms returning from Asian host countries, even though Asia is the leading offshore manufacturing destination and the setting in which most reshoring projects originate. There is therefore no consolidated, firm-level account of the barriers that manufacturing firms face when they attempt to implement reshoring from Asian markets.</w:t>
       </w:r>
     </w:p>
     <w:p>
       <w:r>
-        <w:t>This thesis addresses that gap by systematically reviewing and synthesising the existing literature. The study is guided by the following core research question:</w:t>
+        <w:t>This thesis aims to fill this gap by systematically reviewing and synthesising the existing literature. The study is guided by the following core research question:</w:t>
       </w:r>
     </w:p>
     <w:p>
@@ -104,12 +104,12 @@
     </w:p>
     <w:p>
       <w:r>
-        <w:t>The study pursues four objectives, which correspond to the research questions. The first objective is to identify the barriers to reshoring implementation reported in the peer-reviewed literature, using a systematic literature review as the research method; the thesis does not collect primary interview, survey, or company data. The second objective is to classify the identified barriers into a systematic firm-level framework consisting of four categories: regulatory/institutional, cultural/organisational, cost/operational, and asset/capability barriers. The third objective is to interpret these barriers through two established theoretical perspectives, Transaction Cost Economics and the Resource-Based View, in order to explain why the return of production is difficult even when the decision to reshore has already been taken. The fourth objective is to derive managerial implications that indicate how international businesses can anticipate and mitigate these barriers when planning and executing reshoring projects from Asian markets.</w:t>
+        <w:t>The study pursues four objectives, which are aligned with the research questions. The first objective is to identify the barriers to reshoring implementation reported in the peer-reviewed literature; the thesis does not collect primary interview, survey, or company data, but instead uses a systematic literature review as its research method. The second objective is to categorise the identified barriers into a systematic firm-level framework of four categories: regulatory/institutional, cultural/organisational, cost/operational, and asset/capability barriers. The third objective is to interpret these barriers through two established theoretical perspectives, Transaction Cost Economics and the Resource-Based View, in order to explain why the return of production remains challenging even after the decision to reshore has been made. The fourth objective is to derive managerial implications that suggest how international businesses can anticipate and address these barriers when planning and implementing reshoring from Asian markets.</w:t>
       </w:r>
     </w:p>
     <w:p>
       <w:r>
-        <w:t>In sum, this chapter has introduced the shift from cost-driven offshoring towards a renewed interest in reshoring, and has argued that the implementation of reshoring, rather than the decision alone, deserves systematic attention. The research problem, the guiding research questions, and the objectives of the study have been defined. The following chapter reviews the relevant literature: it defines reshoring and distinguishes it from related relocation forms, presents the theoretical foundations of the study, and examines the current state of knowledge on reshoring barriers.</w:t>
+        <w:t>In sum, this chapter has presented the shift from cost-based offshoring towards renewed interest in reshoring and has argued that the implementation of reshoring, not the decision alone, deserves systematic attention. The research problem, the research questions, and the objectives of the study have been formulated. The following chapter reviews the relevant literature: it defines reshoring and differentiates it from related relocation forms, presents the theoretical foundations of the study, and examines the current state of knowledge on reshoring barriers.</w:t>
       </w:r>
     </w:p>
     <w:p>
@@ -122,7 +122,7 @@
     </w:p>
     <w:p>
       <w:r>
-        <w:t>This chapter establishes the conceptual and theoretical foundations of the study. Section 2.1 defines reshoring and distinguishes it from related forms of manufacturing relocation. Section 2.2 introduces Transaction Cost Economics and the Resource-Based View as the analytical lenses of the thesis. Section 2.3 separates the drivers of reshoring from the implementation barriers that form the object of this study. Section 2.4 reviews the existing knowledge on reshoring barriers and identifies the research gap that the thesis addresses.</w:t>
+        <w:t>This chapter provides the conceptual and theoretical background for the study. It first defines reshoring and differentiates it from related forms of manufacturing relocation, before introducing Transaction Cost Economics and the Resource-Based View as the analytical lenses of the thesis. The chapter then distinguishes the drivers of reshoring from the implementation barriers that form the object of this study, and closes by reviewing what is currently known about reshoring barriers and identifying the research gap the thesis addresses.</w:t>
       </w:r>
     </w:p>
     <w:p>
@@ -158,17 +158,17 @@
     </w:p>
     <w:p>
       <w:r>
-        <w:t>The reshoring literature draws on a range of theoretical perspectives rather than a single unified theory; Wiesmann et al. (2017) observe that there is currently no consensus on a "theory of reshoring" and survey the theories that prior research has employed. Individual studies adopt different lenses: Li et al. (2025) ground their empirical analysis in Dunning's eclectic paradigm, Pedroletti (2025) applies a business-network perspective from internationalisation-process theory, and D'Ambrosio and Lavoratori (2025) build on trade-theoretic work on de-globalisation and global value chains. Against this plural background, the present thesis adopts Transaction Cost Economics and the Resource-Based View as its two interpretive lenses. These are used as the thesis's own analytical framework for organising and explaining the barriers identified in the literature; where a reviewed study employs a different theory, the study's own framing is reported as such.</w:t>
+        <w:t>The reshoring literature is based on a variety of theoretical approaches rather than a single unified theory; Wiesmann et al. (2017) observe that there is currently no consensus on a "theory of reshoring" and survey the theories used in previous studies. The lenses of individual studies vary: Li et al. (2025) draw on Dunning's eclectic paradigm for their empirical analysis, Pedroletti (2025) uses a business-network perspective from internationalisation-process theory, and D'Ambrosio and Lavoratori (2025) build on trade-theoretic work on de-globalisation and global value chains. Against this plural background, the present thesis adopts Transaction Cost Economics and the Resource-Based View as its two interpretive lenses. These are used as the thesis's own analytical framework to organise and explain the barriers identified in the literature; where a reviewed study uses a different theory, the study's own framing is reported as such.</w:t>
       </w:r>
     </w:p>
     <w:p>
       <w:r>
-        <w:t>Transaction Cost Economics directs attention to the costs of organising economic activity across firm and country boundaries. In the reshoring context, this perspective illuminates the exit side of implementation: offshore arrangements embody committed investments and contractual obligations, so unwinding them generates real costs. Empirical findings consistent with this logic include strict host-country layoff regulations and locked investments that impede a rapid exit (Li et al., 2025), plant-closure fees and fiscal obligations reported in the review literature (Di Stefano &amp; Fratocchi, 2019), and the coordination burden that arises when production is split between home and host locations during a partial return (Pedroletti, 2025). Transaction-cost reasoning also highlights hidden costs: Ocicka (2016) argues that sourcing decisions based on unit price alone systematically understate the total cost of offshore acquisition, and Boffelli et al. (2021) document how firms underestimate the operational adjustments that relocation requires.</w:t>
+        <w:t>Transaction Cost Economics directs attention to the costs of organising economic activity across firm and country boundaries. In the reshoring context, this view sheds light on the exit side of implementation: offshore arrangements embody committed investments and contractual obligations, and unwinding them carries real costs. Empirical findings consistent with this logic include strict host-country layoff regulations and locked investments that make a rapid exit difficult (Li et al., 2025), plant-closure fees and fiscal obligations reported in the review literature (Di Stefano &amp; Fratocchi, 2019), and the coordination burden that arises when production is split between home and host locations during a partial return (Pedroletti, 2025). Transaction-cost reasoning also points to hidden costs: Ocicka (2016) argues that sourcing decisions based on unit price alone systematically underestimate the total cost of offshore acquisition, and Boffelli et al. (2021) document how firms underestimate the operational adjustments that relocation requires.</w:t>
       </w:r>
     </w:p>
     <w:p>
       <w:r>
-        <w:t>The Resource-Based View, by contrast, illuminates the arrival side of implementation. It conceives of the firm as a bundle of resources and capabilities, and it implies that reshoring succeeds only if the firm can rebuild or reacquire the productive resources — skills, machinery, routines, and supplier relationships — that the home operation requires. The reshoring literature repeatedly reports precisely such capability constraints: the erosion of domestic manufacturing competences and capacity after prolonged offshoring (Wiesmann et al., 2017), the scarcity of specialised manpower encountered by returning firms (Di Mauro et al., 2018), and the need to rebuild machinery, tooling, and workforce skills documented in case evidence (Pegoraro et al., 2022). Conceptual work reinforces this reading: D'Ambrosio and Lavoratori (2025) argue that reshoring confronts firms with new domestic fixed costs and capability requirements, while established value chains remain "sticky" because of the resources sunk into them. Taken together, the two lenses are complementary — Transaction Cost Economics explains why leaving the host country is costly, and the Resource-Based View explains why re-establishing production at home is demanding.</w:t>
+        <w:t>The Resource-Based View, on the other hand, sheds light on the arrival side of implementation. It views the firm as a collection of resources and capabilities, and it implies that reshoring succeeds only if the firm can rebuild or reacquire the productive resources — skills, machinery, routines, and supplier relationships — that the home operation requires. The reshoring literature repeatedly reports exactly such capability constraints: the erosion of domestic manufacturing competences and capacity after prolonged offshoring (Wiesmann et al., 2017), the scarcity of specialised manpower encountered by returning firms (Di Mauro et al., 2018), and the need to rebuild machinery, tooling, and workforce skills documented in case evidence (Pegoraro et al., 2022). Conceptual work complements this reading: D'Ambrosio and Lavoratori (2025) contend that reshoring confronts firms with new fixed costs and capability demands, while existing value chains remain "sticky" because of the resources invested in them. Taken together, the two lenses are complementary: Transaction Cost Economics explains why leaving the host country is costly, and the Resource-Based View explains why re-establishing production at home is demanding.</w:t>
       </w:r>
     </w:p>
     <w:p>
@@ -181,12 +181,12 @@
     </w:p>
     <w:p>
       <w:r>
-        <w:t>A central conceptual distinction for this thesis separates the reasons why firms consider reshoring from the difficulties they face when they carry it out. The driver literature is comparatively mature. Di Mauro et al. (2018) find that while offshoring is predominantly motivated by cost reduction, backshoring typically follows a strategic reorientation toward customer-perceived value, and they characterise the return as strategic evolution rather than the correction of a managerial mistake. Firm-level survey evidence links reshoring decisions to home-country conditions (Wan et al., 2019) and to Industry 4.0 adoption, pandemic experience, and made-in effects (Stentoft et al., 2025), and survey and case research has examined the relationship between digital-technology adoption and backshoring decisions (Kamp &amp; Gibaja, 2021). Case research adds brand-related motives: Robinson and Hsieh (2016) show how a luxury clothing firm's repositioning around provenance and quality triggered the consolidation of manufacturing at home. Quality problems, coordination difficulties, and inflexibility experienced at offshore sites likewise appear as motives for return (Di Mauro et al., 2018).</w:t>
+        <w:t>A central conceptual distinction in this thesis separates the motivations for reshoring from the difficulties of carrying it out. The driver literature is relatively well developed. Di Mauro et al. (2018) conclude that offshoring is mainly driven by cost reduction, whereas backshoring usually follows a strategic reorientation towards customer-perceived value, and they characterise the return as strategic evolution rather than the correction of a managerial mistake. Firm-level survey evidence links reshoring decisions to home-country conditions (Wan et al., 2019) and to Industry 4.0 adoption, pandemic experience, and made-in effects (Stentoft et al., 2025), and survey and case research has examined the relationship between digital-technology adoption and backshoring decisions (Kamp &amp; Gibaja, 2021). Case studies add brand-related motives: Robinson and Hsieh (2016) demonstrate how a luxury clothing company's repositioning around provenance and quality led to the consolidation of production in the home country. Problems with quality, coordination, and flexibility at offshore locations also appear as reasons for return (Di Mauro et al., 2018).</w:t>
       </w:r>
     </w:p>
     <w:p>
       <w:r>
-        <w:t>Drivers, however, explain only why firms want to return — not whether the return succeeds. Implementation barriers, as understood in this thesis, are the difficulties that arise when a firm prepares, transfers, rebuilds, integrates, and stabilises production at home after the reshoring decision has been taken. The distinction is analytically consequential because factors prominent in the driver literature, such as rising foreign wages or supply-chain disruptions, are not implementation barriers unless the evidence shows they obstructed the implementation process itself. The clearest empirical demonstration that the two stages are distinct comes from Boffelli et al. (2021), who analyse mistakes across four fashion-industry relocation cases and differentiate decision-making mistakes from implementation mistakes. Their central finding is that failures of relocation initiatives were directly connected to mistakes made in the implementation phase, leading to the conclusion that "doing things right" in implementation matters more than "doing the right thing" at the decision stage. The process framework of Pedroletti and Ciabuschi (2023) supports the same separation at a conceptual level, treating implementation as a stage with its own contingencies and outcomes.</w:t>
+        <w:t>Drivers, however, explain only why companies want to come back — not whether the return succeeds. As defined in this thesis, implementation barriers are the difficulties that occur when a firm prepares, transfers, rebuilds, integrates, and stabilises production at home after the reshoring decision has been made. The distinction is analytically important because factors prominent in the driver literature, such as rising foreign wages or supply-chain disruptions, are not implementation barriers unless the evidence indicates that they obstructed the implementation process itself. The clearest empirical demonstration that the two stages are distinct is provided by Boffelli et al. (2021), who examine mistakes in four relocation cases in the fashion industry and distinguish decision-making mistakes from implementation mistakes. Their key finding is that failures of relocation initiatives were directly linked to mistakes made in the implementation phase, leading to the conclusion that "doing things right" in implementation matters more than "doing the right thing" at the decision stage. The process framework of Pedroletti and Ciabuschi (2023) supports this separation at a conceptual level, treating implementation as a stage with its own contingencies and outcomes.</w:t>
       </w:r>
     </w:p>
     <w:p>
@@ -199,22 +199,22 @@
     </w:p>
     <w:p>
       <w:r>
-        <w:t>The most systematic early treatment of reshoring barriers is the literature review by Wiesmann et al. (2017), which organises both drivers and barriers into five sets of dynamics: global competitive dynamics, home-country, host-country, supply-chain, and firm-specific factors. On the barrier side, the review reports the loss of access to production resources that existed offshore but are absent at home, shortages of skilled personnel in both host and home countries, and weaknesses in home-country supplier capacity and networks. This taxonomy is valuable but, as review-level evidence, it aggregates findings from heterogeneous primary studies; it also differs in structure from the firm-level framework developed in this thesis, and the two are cross-walked in the analysis rather than treated as equivalent.</w:t>
+        <w:t>The most systematic early treatment of reshoring barriers is the literature review by Wiesmann et al. (2017), who categorise both drivers and barriers into five sets of dynamics: global competitive dynamics, home-country, host-country, supply-chain, and firm-specific factors. On the barrier side, the review notes the loss of access to production resources that were available offshore but are absent at home, shortages of skilled personnel in both the host and home countries, and weaknesses in home-country supplier capacity and networks. This taxonomy is valuable but, as review-level evidence, it aggregates results from heterogeneous primary studies; it also differs in structure from the firm-level framework developed in this thesis, and the two are cross-walked in the analysis rather than treated as equivalent.</w:t>
       </w:r>
     </w:p>
     <w:p>
       <w:r>
-        <w:t>Subsequent review work has extended the barrier discussion in particular directions. Di Stefano and Fratocchi (2019) examine the relationship between backshoring and sustainability and show that environmental and social considerations can function as drivers, outcomes, or barriers, including regulatory and social constraints on exiting the host country. Reviews at the intersection of reshoring and Industry 4.0 (Espíndola et al., 2023; Bilbao-Ubillos et al., 2024) identify technology-readiness themes: digital technologies can favour reshoring by reducing the weight of labour costs and increasing the value of proximity, yet their deployment itself demands new technical skills, organisational adaptation, and investment. Gupta et al. (2023) argue in the same vein that Industry 4.0 plays a dual role, enabling reshoring while simultaneously imposing new capability requirements. Conceptually, D'Ambrosio and Lavoratori (2025) integrate several of these strands, explaining the rarity of reshoring through the stickiness of established value chains, the new fixed costs of domestic production, and firm-size differences — larger firms may prefer nearshoring or friendshoring, whereas smaller, constrained firms may reshore defensively "to survive." Complementary empirical work on high-cost home environments shows that firms manufacturing domestically confront labour-cost pressure, skills shortages, supplier-network gaps, and internal organisational frictions (Mirzaei et al., 2021), conditions that any returning firm inherits.</w:t>
+        <w:t>Later review work has extended the barrier discussion in specific directions. Di Stefano and Fratocchi (2019) explore the connection between backshoring and sustainability and show that environmental and social factors can act as drivers, outcomes, or barriers, including regulatory and social constraints on exiting the host country. Technology-readiness themes emerge from reviews at the intersection of reshoring and Industry 4.0 (Espíndola et al., 2023; Bilbao-Ubillos et al., 2024): digital technologies can make reshoring more attractive by reducing the importance of labour costs and increasing the value of proximity, but their deployment requires new technical skills, organisational adaptation, and investment. In a similar direction, Gupta et al. (2023) argue that Industry 4.0 plays a dual role, facilitating reshoring while introducing new capability demands. Conceptually, D'Ambrosio and Lavoratori (2025) integrate several of these strands, explaining the rarity of reshoring through the stickiness of existing value chains, the new fixed costs of domestic production, and firm-size differences — larger firms may prefer nearshoring or friendshoring, while smaller, constrained firms may reshore defensively "to survive." Empirical work on high-cost home environments shows that companies producing in their home countries face labour-cost pressure, skills shortages, supplier-network gaps, and internal organisational frictions (Mirzaei et al., 2021), conditions that any returning firm inherits.</w:t>
       </w:r>
     </w:p>
     <w:p>
       <w:r>
-        <w:t>Three limitations of this body of knowledge define the research gap. First, the evidence on barriers is fragmented: individual studies report individual obstacles, but consolidated, firm-level syntheses focused specifically on implementation remain scarce, and the implementation stage as such is under-researched relative to the reshoring decision (Ocicka, 2016; Pedroletti &amp; Ciabuschi, 2023). Second, the evidence is heterogeneous in kind — direct case observations, review-level aggregations, and conceptual arguments are frequently cited interchangeably, although they warrant different degrees of confidence. Third, the literature is rarely Asia-specific in a disaggregated way: although Asia is the dominant offshore manufacturing location, most studies report barriers at an aggregate sample level without isolating findings that concern the return from Asian host countries specifically. Direct implementation evidence from identified Asia-to-home cases exists — notably a China-to-UK case documenting skills, machinery, and ramp-up difficulties (Pegoraro et al., 2022) and a China-to-Italy case documenting supplier dependence and coordination burdens in a partial return (Pedroletti, 2025) — but such cases are few. The four-category framework applied in this thesis — regulatory/institutional, cultural/organisational, cost/operational, and asset/capability barriers — is designed to consolidate this fragmented evidence at the firm level while preserving the distinctions between evidence types and between Asia-specific and general findings.</w:t>
+        <w:t>Three limitations of this body of knowledge define the research gap. First, evidence on barriers is scattered: individual studies identify individual obstacles, but consolidated, firm-level syntheses focused specifically on implementation are rare, and the implementation stage is under-researched compared with the reshoring decision (Ocicka, 2016; Pedroletti &amp; Ciabuschi, 2023). Second, the evidence is heterogeneous in kind — direct case observations, review-level aggregations, and conceptual arguments are often cited interchangeably, although they warrant different degrees of confidence. Third, the literature is rarely disaggregated in an Asia-specific way: although Asia is the main offshore manufacturing destination, most studies report barriers at the sample level without distinguishing findings that concern the return from Asian host countries. Direct implementation evidence from identified Asia-to-home cases does exist — notably a China-to-UK case documenting skills, machinery, and ramp-up difficulties (Pegoraro et al., 2022) and a China-to-Italy case documenting supplier dependence and coordination burdens in a partial return (Pedroletti, 2025) — but such cases are few. The four categories used in this thesis — regulatory/institutional, cultural/organisational, cost/operational, and asset/capability barriers — are intended to bring this fragmented evidence together at the firm level while preserving the distinctions between evidence types and between Asia-specific and general findings.</w:t>
       </w:r>
     </w:p>
     <w:p>
       <w:r>
-        <w:t>In summary, this chapter has defined reshoring as the return of previously offshored manufacturing from an Asian host country to the firm's home country, distinguished it from re-offshoring and nearshoring, and introduced Transaction Cost Economics and the Resource-Based View as complementary lenses on the exit-side and arrival-side difficulties of implementation. It has separated the mature literature on reshoring drivers from the less developed knowledge on implementation barriers and has identified a gap: existing barrier evidence is fragmented, mixed in evidentiary kind, and rarely disaggregated for Asian host countries. The following chapter describes the systematic literature review methodology through which this thesis consolidates that evidence.</w:t>
+        <w:t>Overall, this chapter has defined reshoring as the return of previously offshored manufacturing from an Asian host country to the firm's home country, differentiated it from re-offshoring and nearshoring, and introduced Transaction Cost Economics and the Resource-Based View as complementary lenses on the exit-side and arrival-side difficulties of implementation. It has separated the well-established literature on reshoring drivers from the less developed knowledge on implementation barriers and has identified a gap: existing barrier evidence is scattered, mixed in kind, and rarely disaggregated for Asian host countries. The systematic literature review through which this thesis consolidates that evidence is described in the following chapter.</w:t>
       </w:r>
     </w:p>
     <w:p>
@@ -227,7 +227,7 @@
     </w:p>
     <w:p>
       <w:r>
-        <w:t>This chapter explains how the thesis was designed and carried out. Section 3.1 sets out the overall research design and justifies the choice of a systematic literature review. Section 3.2 describes how the source material was collected, screened, and quality-assessed, and how this process was documented. Section 3.3 explains how the included evidence was analysed to produce the firm-level barrier framework, and closes with the methodological limitations of the approach.</w:t>
+        <w:t>This chapter describes how the thesis was designed and carried out: why a systematic literature review is the appropriate method for the research questions, how the source material was collected, screened, and quality-assessed, and how the included evidence was analysed to produce the firm-level barrier framework. The chapter closes with the methodological limitations of the approach.</w:t>
       </w:r>
     </w:p>
     <w:p>
@@ -240,17 +240,17 @@
     </w:p>
     <w:p>
       <w:r>
-        <w:t>The thesis adopts a systematic literature review (SLR) as its research method. The choice follows directly from the nature of the research question. The central question asks what barriers manufacturing firms face when implementing reshoring strategies from Asian markets, and the two sub-questions ask how these barriers can be categorised into a systematic firm-level framework and what managerial implications follow. Answering these questions does not require the generation of new primary observations but rather the consolidation and structured synthesis of evidence that is already dispersed across a fragmented body of research. A systematic review is well suited to this purpose because it aggregates existing findings on a bounded question through explicit, documented, and reproducible procedures for searching, selecting, and analysing the literature.</w:t>
+        <w:t>The research method used in this thesis is a systematic literature review (SLR). The choice follows directly from the nature of the research question, which asks what barriers manufacturing firms face when implementing reshoring strategies from Asian markets, while the two sub-questions ask how these barriers can be categorised into a systematic firm-level framework and what managerial implications follow. Answering these questions does not require new primary observations, but rather a structured synthesis of evidence that already exists but is spread across a fragmented body of research. A systematic review is appropriate for this purpose because it brings together the findings of the literature on a bounded question through explicit, documented, and reproducible procedures for searching, selecting, and analysing the literature.</w:t>
       </w:r>
     </w:p>
     <w:p>
       <w:r>
-        <w:t>Snyder (2019) argues that a literature review can serve as a research methodology in its own right, and distinguishes systematic, semi-systematic, and integrative review types, each suited to a different purpose. A systematic review is appropriate for a sufficiently specific question that can be addressed by identifying and appraising a defined body of relevant studies through pre-established criteria. Because the present research question is narrow and firm-level in focus, a systematic design is the most appropriate of the three, even though the underlying evidence is methodologically heterogeneous. Snyder (2019) further describes the review process as unfolding in broadly four phases — designing the review, conducting the search and selection, analysing the retrieved material, and writing up the results — and this sequence structures the remainder of the chapter. The framework is used here as a general methodological justification rather than as a complete protocol, and it is supplemented by dedicated reporting and synthesis guidance in the sections that follow.</w:t>
+        <w:t>According to Snyder (2019), a literature review can serve as a research methodology in its own right, and three review types can be distinguished — systematic, semi-systematic, and integrative — each suited to a different purpose. A systematic review is suitable for a question that is specific enough to be answered by identifying and evaluating a body of relevant studies according to predetermined criteria. The present research question is narrow and firm-level in focus, and a systematic design is therefore the most suitable of the three, despite the methodological heterogeneity of the underlying evidence. Snyder (2019) also outlines the review process in broadly four stages — designing the review, conducting the search and selection, analysing the retrieved material, and writing up the results — and this sequence structures the remainder of the chapter. The framework is applied here as a general methodological justification and is complemented by dedicated reporting and synthesis guidance in the sections below.</w:t>
       </w:r>
     </w:p>
     <w:p>
       <w:r>
-        <w:t>Consistent with this design, the thesis does not collect primary interview, survey, or company data; all evidence derives from previously published, peer-reviewed research. The intended contribution is therefore integrative: the review consolidates scattered findings into a single firm-level framework of reshoring implementation barriers, in line with established review-based work in the reshoring field (Tsai &amp; Urmetzer, 2024). This design allows the study to address the research questions directly while remaining transparent about the origin and strength of each piece of evidence.</w:t>
+        <w:t>In keeping with this design, the thesis does not gather primary interview, survey, or company data; all evidence comes from previously published, peer-reviewed research. The contribution is therefore integrative: the review brings together findings from individual studies into a single firm-level framework of reshoring implementation barriers, in line with established review-based work in the reshoring field (Tsai &amp; Urmetzer, 2024). This design enables the study to answer the research questions directly while remaining transparent about the origin and strength of each piece of evidence.</w:t>
       </w:r>
     </w:p>
     <w:p>
@@ -263,22 +263,22 @@
     </w:p>
     <w:p>
       <w:r>
-        <w:t>The literature search and selection were documented with reference to the PRISMA 2020 reporting guidelines and their accompanying explanation and elaboration guidance (Page et al., 2021a, 2021b). PRISMA was used as a reporting framework that structures the transparent documentation of identification, screening, and inclusion; it was not treated as a method of evidence synthesis, which is addressed separately in Section 3.3. [SEARCH STRATEGY DETAILS TO BE COMPLETED BY AUTHOR: databases searched, full keyword strings and Boolean combinations, language and publication-type filters, the date on which each database was last searched, and the number of records initially identified — these figures are required to complete the PRISMA flow diagram in Appendix A.] Following identification, duplicate records were removed, titles and abstracts were screened against the eligibility criteria, and the remaining full texts were assessed in full before a final inclusion decision was taken.</w:t>
+        <w:t>The literature search and selection were documented with reference to the PRISMA 2020 reporting guidelines and their accompanying explanation and elaboration guidance (Page et al., 2021a, 2021b). PRISMA was used as a framework for the transparent documentation of identification, screening, and inclusion, not as a method of evidence synthesis, which is addressed separately in Section 3.3. [SEARCH STRATEGY DETAILS TO BE COMPLETED BY AUTHOR: databases searched, full keyword strings and Boolean combinations, language and publication-type filters, the date on which each database was last searched, and the number of records initially identified — these figures are required to complete the PRISMA flow diagram in Appendix A.] After identification, duplicate records were removed, titles and abstracts were screened against the eligibility criteria, and the remaining full texts were assessed in full before a final inclusion decision was made.</w:t>
       </w:r>
     </w:p>
     <w:p>
       <w:r>
-        <w:t>Eligibility was governed by the reshoring definition adopted in this thesis. To enter the formal analytical sample, a study had to address genuine reshoring — the return of previously offshored manufacturing to the firm's home country. Studies concerned solely with China+1 configurations, China-to-Southeast-Asia relocation, re-offshoring, nearshoring without a return home, or foreign-to-foreign relocation were excluded from barrier coding as not constituting genuine reshoring, although a small number were retained as contextual sources for the Introduction and Discussion. Because implementation evidence is rarely disaggregated by host region in the published literature, Asia specificity was applied not as an absolute inclusion filter but as a recorded classification dimension: every source received an Asia-specificity rating, and only findings from sources whose data explicitly link an Asian host location to a return home are presented as Asia-specific in the Results. Recording explicit inclusion and exclusion criteria of this kind, and documenting the specific reasons for excluding full texts, is a reporting requirement emphasised in the PRISMA guidance (Page et al., 2021a).</w:t>
+        <w:t>Eligibility was governed by the reshoring definition adopted in this thesis. To qualify for the formal analytical sample, a study had to address genuine reshoring — the return of previously offshored manufacturing to the firm's home country. Studies concerned solely with China+1 configurations, China-to-Southeast-Asia relocation, re-offshoring, nearshoring without a return home, or foreign-to-foreign relocation were excluded from barrier coding, as these relocation forms do not constitute genuine reshoring; a small number were retained as contextual sources for the Introduction and Discussion. Because implementation evidence is not always disaggregated by host region in the published literature, Asia specificity was not applied as an absolute inclusion filter but as a recorded classification dimension: every source received an Asia-specificity rating, and only findings from sources whose data explicitly connect an Asian host location to a return home are presented as Asia-specific in the Results. Recording explicit inclusion and exclusion criteria of this kind, and documenting the specific reasons for excluding full texts, is a reporting requirement emphasised in the PRISMA guidance (Page et al., 2021a).</w:t>
       </w:r>
     </w:p>
     <w:p>
       <w:r>
-        <w:t>Selection followed a small set of decision rules that separate the corpus by function. The complete corpus comprises 33 sources. Of these, 21 peer-reviewed reshoring studies form the formal analytical sample from which the barrier framework is built. A further set of contextual and policy sources — covering, for example, macro-level relocation patterns and China+1 dynamics — was retained only to support the Introduction and Discussion and was deliberately excluded from barrier coding, because these sources describe the broader environment rather than firm-level implementation. Five methodology sources were retained solely to justify the research design, PRISMA reporting, and the coding and synthesis procedures, and likewise contribute nothing to the barrier evidence base.</w:t>
+        <w:t>Selection followed a small set of decision rules that divide the corpus according to function. The full corpus consists of 33 sources. Of these, 21 peer-reviewed reshoring studies constitute the formal analytical sample from which the barrier framework is developed. A further set of contextual and policy sources — covering, for example, macro-level relocation patterns and China+1 dynamics — was retained only to support the Introduction and Discussion and was deliberately excluded from barrier coding, because these sources describe the broader environment rather than firm-level implementation. Five methodology sources were retained solely to justify the research design, PRISMA reporting, and the coding and synthesis procedures, and likewise contribute nothing to the barrier evidence base.</w:t>
       </w:r>
     </w:p>
     <w:p>
       <w:r>
-        <w:t>The formal sample was additionally characterised along two quality-assessment dimensions recorded for every source. The first is an evidence-level classification ranging from L1 to L5: L1 denotes direct implementation evidence from cases, interviews, or observed reshoring processes; L2 covers reshoring-related empirical, review, or conceptual evidence that is not direct implementation observation; L3 denotes contextual macro or sector evidence; L4 denotes methodological or decision-support material; and L5 lies outside the core reshoring definition. The second dimension is an Asia-specificity rating (high, medium, or low), where a source is classified as high only when its data or case explicitly links an Asian host location to a return home. These two dimensions govern how much weight each source can carry and are reported alongside the results rather than collapsed into a single quality score. The full flow of records from identification to final inclusion is presented in the PRISMA flow diagram in Appendix A. Screening and selection were conducted by a single researcher, which is disclosed here as a limitation of the selection process.</w:t>
+        <w:t>The formal sample was additionally characterised along two quality-assessment dimensions recorded for every source. The first is an evidence-level classification ranging from L1 to L5: L1 denotes direct implementation evidence from cases, interviews, or observed reshoring processes; L2 covers reshoring-related empirical, review, or conceptual evidence that is not direct implementation observation; L3 denotes contextual macro or sector evidence; L4 denotes methodological or decision-support material; and L5 lies outside the core reshoring definition. The second dimension is an Asia-specificity rating (high, medium, or low); a source is rated high only when its data or case explicitly links an Asian host location to a return home. These two dimensions govern the weight each source can carry and are reported alongside the results rather than collapsed into a single quality score. The full flow of records from identification to final inclusion is presented in the PRISMA flow diagram in Appendix A. Screening and selection were conducted by a single researcher, which is disclosed here as a limitation of the selection process.</w:t>
       </w:r>
     </w:p>
     <w:p>
@@ -291,27 +291,27 @@
     </w:p>
     <w:p>
       <w:r>
-        <w:t>The included evidence was analysed through an adapted thematic synthesis based on Thomas and Harden (2008), who set out a transparent three-stage procedure for synthesising findings across studies. In the first stage, relevant findings reported in the included studies were coded at the level of meaningful evidence segments. In the second stage, conceptually similar codes were grouped into descriptive themes that remained close to the content of the primary studies. In the third stage, the descriptive themes were interpreted to generate higher-order analytical themes that address the research questions and move beyond what any single study states in isolation. A central strength of this procedure is that it preserves an auditable link between the review's conclusions and the original text of the primary studies, so that each analytical theme can be traced back through the descriptive themes to the coded evidence.</w:t>
+        <w:t>The included evidence was analysed through an adapted thematic synthesis based on Thomas and Harden (2008), who set out a transparent three-stage procedure for synthesising findings across studies. In the first stage, relevant findings reported in the included studies were coded at the level of meaningful evidence segments. In the second stage, conceptually similar codes were clustered into descriptive themes that stayed close to the content of the primary studies. In the third stage, the descriptive themes were interpreted to produce higher-order analytical themes that address the research questions and go beyond what any single study states in isolation. A key strength of this procedure is that it maintains an auditable trail from the review's conclusions back to the original text of the primary studies, so that each analytical theme can be traced through the descriptive themes to the coded evidence.</w:t>
       </w:r>
     </w:p>
     <w:p>
       <w:r>
-        <w:t>The coding itself followed a hybrid deductive–inductive logic, for which Mayring (2014) provides the methodological foundation. Mayring (2014) treats qualitative content analysis as a systematic, rule-bound procedure and describes deductive category application and inductive category development as complementary rather than mutually exclusive. Following this logic, the four organising categories of the thesis framework — regulatory/institutional, cultural/organisational, cost/operational, and asset/capability — were defined deductively from the theoretical framework and the research questions and applied as an a priori coding frame. The more specific barrier themes within each category were then developed inductively from the included studies, and category boundaries were refined where the a priori frame did not fully capture the coded material. This yielded a set of barrier themes nested within the four deductive categories.</w:t>
+        <w:t>The coding itself followed a hybrid deductive–inductive logic, for which Mayring (2014) provides the methodological foundation. Mayring (2014) treats qualitative content analysis as a systematic, rule-governed procedure in which deductive category application and inductive category development are complementary rather than mutually exclusive. Following this logic, the four organising categories of the thesis framework — regulatory/institutional, cultural/organisational, cost/operational, and asset/capability — were derived deductively from the theoretical framework and the research questions and applied as an a priori coding frame. The more specific barrier themes within each category were then developed inductively from the included studies, and category boundaries were adjusted where the a priori frame did not fully capture the coded material. This resulted in a set of barrier themes nested within the four deductive categories.</w:t>
       </w:r>
     </w:p>
     <w:p>
       <w:r>
-        <w:t>Two coding rules protected the integrity of the synthesis. First, in accordance with the corpus's own decision rule, the three evidence types — direct empirical findings from a study's own data, findings reported through a literature review, and barriers argued on conceptual grounds — were coded and reported separately and never summed into a single frequency count, because a survey result, a review finding, and a conceptual argument do not carry equivalent evidential weight. Second, drivers and implementation barriers were kept strictly distinct: only difficulties arising when firms prepare, transfer, rebuild, integrate, or stabilise production at home were coded as implementation barriers, whereas motives for considering reshoring — such as geopolitical tensions, rising Asian wages, or supply-chain disruptions — were not coded as barriers unless a study specifically showed that they obstructed the implementation process.</w:t>
+        <w:t>Two coding rules protected the integrity of the synthesis. First, in line with the corpus's own decision rule, the three evidence types — direct empirical findings from a study's own data, findings reported through a literature review, and barriers argued on conceptual grounds — were coded and reported separately and never summed into a single frequency count, because a survey result, a review finding, and a conceptual argument do not carry equivalent evidential weight. Second, drivers and implementation barriers were kept strictly distinct: only difficulties in preparing, transferring, rebuilding, integrating, or stabilising production at home were coded as implementation barriers, while motives for considering reshoring — such as geopolitical tensions, rising Asian wages, or supply-chain disruptions — were not coded as barriers unless a study explicitly showed that they hindered the implementation process.</w:t>
       </w:r>
     </w:p>
     <w:p>
       <w:r>
-        <w:t>Several methodological limitations follow from this design. As a secondary method, an SLR is bound by the coverage, quality, and completeness of the published literature and by the risk of publication bias; it synthesises existing findings rather than observing reshoring directly. The corpus's own caution reinforces this: because direct empirical, review, and conceptual evidence carry different weights, the strength of any barrier claim depends on the type of evidence behind it and cannot be inferred from how often the barrier is mentioned. Most importantly, genuinely Asia-specific direct implementation evidence rests on only a small number of cases — principally two single-case studies documenting returns from China — so Asia-specific findings are reported as illustrative rather than generalisable, a constraint that is carried forward explicitly into the results and the limitations discussion.</w:t>
+        <w:t>Several methodological limitations follow from this design. As a secondary method, an SLR is constrained by the coverage, quality, and completeness of the published literature and by the risk of publication bias; it synthesises existing findings rather than observing reshoring directly. The corpus's own caution reinforces this point: because direct empirical, review, and conceptual evidence carry different weights, the strength of any barrier claim depends on the type of evidence behind it and cannot be inferred from how often the barrier is mentioned. Most importantly, genuinely Asia-specific direct implementation evidence rests on only a small number of cases — principally two single-case studies documenting returns from China — so Asia-specific findings are reported as illustrative rather than generalisable, a constraint stated explicitly in the results and the limitations discussion.</w:t>
       </w:r>
     </w:p>
     <w:p>
       <w:r>
-        <w:t>In summary, this chapter has justified the systematic literature review as the method best matched to the research questions, described how the 33-source corpus and its 21-source formal analytical sample were assembled, screened, and quality-assessed under PRISMA reporting, and set out the hybrid deductive–inductive thematic synthesis through which the barriers were coded and organised. It has also stated the principal limitations of the approach and the rules that keep the evidence types and the driver–barrier distinction separate. The following chapter presents the results of this synthesis, reporting the barriers identified in the literature within the four categories of the firm-level framework.</w:t>
+        <w:t>To summarise, this chapter has argued that the systematic literature review is the method best matched to the research questions, explained how the 33-source corpus and its 21-source formal analytical sample were assembled, screened, and quality-assessed under PRISMA reporting, and outlined the hybrid deductive–inductive thematic synthesis through which the barriers were coded and organised. It has also stated the principal limitations of the approach and the rules that keep the evidence types separate and maintain the driver–barrier distinction. The following chapter presents the results of this synthesis, reporting the barriers identified in the literature within the four categories of the firm-level framework.</w:t>
       </w:r>
     </w:p>
     <w:p>

</xml_diff>